<commit_message>
cambios que incluyen exportaciones y tema de usuario
</commit_message>
<xml_diff>
--- a/170000.docx
+++ b/170000.docx
@@ -44,7 +44,7 @@
                     </pic:cNvPicPr>
                   </pic:nvPicPr>
                   <pic:blipFill>
-                    <a:blip r:embed="rId9"/>
+                    <a:blip r:embed="rId10"/>
                     <a:srcRect/>
                     <a:stretch>
                       <a:fillRect/>
@@ -326,7 +326,7 @@
                     </pic:cNvPicPr>
                   </pic:nvPicPr>
                   <pic:blipFill>
-                    <a:blip r:embed="rId10"/>
+                    <a:blip r:embed="rId11"/>
                     <a:srcRect/>
                     <a:stretch>
                       <a:fillRect/>
@@ -402,7 +402,8 @@
           <w:sz w:val="12"/>
         </w:rPr>
         <w:sectPr>
-          <w:footerReference r:id="rId5" w:type="default"/>
+          <w:headerReference r:id="rId5" w:type="default"/>
+          <w:footerReference r:id="rId6" w:type="default"/>
           <w:type w:val="continuous"/>
           <w:pgSz w:w="12240" w:h="15840"/>
           <w:pgMar w:top="320" w:right="300" w:bottom="280" w:left="280" w:header="720" w:footer="720" w:gutter="0"/>
@@ -855,12 +856,6 @@
             <w:insideH w:val="none" w:color="auto" w:sz="0" w:space="0"/>
             <w:insideV w:val="none" w:color="auto" w:sz="0" w:space="0"/>
           </w:tblBorders>
-          <w:tblCellMar>
-            <w:top w:w="0" w:type="dxa"/>
-            <w:left w:w="0" w:type="dxa"/>
-            <w:bottom w:w="0" w:type="dxa"/>
-            <w:right w:w="0" w:type="dxa"/>
-          </w:tblCellMar>
         </w:tblPrEx>
         <w:trPr>
           <w:trHeight w:val="260" w:hRule="atLeast"/>
@@ -1266,56 +1261,6 @@
                 <w:sz w:val="14"/>
               </w:rPr>
             </w:pPr>
-            <w:r>
-              <w:drawing>
-                <wp:anchor distT="0" distB="0" distL="0" distR="0" simplePos="0" relativeHeight="251660288" behindDoc="1" locked="0" layoutInCell="1" allowOverlap="1">
-                  <wp:simplePos x="0" y="0"/>
-                  <wp:positionH relativeFrom="page">
-                    <wp:posOffset>2192655</wp:posOffset>
-                  </wp:positionH>
-                  <wp:positionV relativeFrom="page">
-                    <wp:posOffset>168910</wp:posOffset>
-                  </wp:positionV>
-                  <wp:extent cx="2886710" cy="3592830"/>
-                  <wp:effectExtent l="0" t="0" r="8890" b="0"/>
-                  <wp:wrapNone/>
-                  <wp:docPr id="5" name="image3.png" descr="/home/usi/Escritorio/Utilidad PDF/programaPythonPDF/logo1-removebg-preview.pnglogo1-removebg-preview"/>
-                  <wp:cNvGraphicFramePr>
-                    <a:graphicFrameLocks xmlns:a="http://schemas.openxmlformats.org/drawingml/2006/main" noChangeAspect="1"/>
-                  </wp:cNvGraphicFramePr>
-                  <a:graphic xmlns:a="http://schemas.openxmlformats.org/drawingml/2006/main">
-                    <a:graphicData uri="http://schemas.openxmlformats.org/drawingml/2006/picture">
-                      <pic:pic xmlns:pic="http://schemas.openxmlformats.org/drawingml/2006/picture">
-                        <pic:nvPicPr>
-                          <pic:cNvPr id="5" name="image3.png" descr="/home/usi/Escritorio/Utilidad PDF/programaPythonPDF/logo1-removebg-preview.pnglogo1-removebg-preview"/>
-                          <pic:cNvPicPr>
-                            <a:picLocks noChangeAspect="1"/>
-                          </pic:cNvPicPr>
-                        </pic:nvPicPr>
-                        <pic:blipFill>
-                          <a:blip r:embed="rId9">
-                            <a:lum bright="58000" contrast="-70000"/>
-                          </a:blip>
-                          <a:srcRect/>
-                          <a:stretch>
-                            <a:fillRect/>
-                          </a:stretch>
-                        </pic:blipFill>
-                        <pic:spPr>
-                          <a:xfrm>
-                            <a:off x="0" y="0"/>
-                            <a:ext cx="2886710" cy="3592830"/>
-                          </a:xfrm>
-                          <a:prstGeom prst="rect">
-                            <a:avLst/>
-                          </a:prstGeom>
-                        </pic:spPr>
-                      </pic:pic>
-                    </a:graphicData>
-                  </a:graphic>
-                </wp:anchor>
-              </w:drawing>
-            </w:r>
           </w:p>
         </w:tc>
         <w:tc>
@@ -1427,40 +1372,17 @@
         <w:ind w:left="3600" w:leftChars="0" w:right="0" w:firstLine="720" w:firstLineChars="0"/>
         <w:jc w:val="right"/>
         <w:rPr>
+          <w:sz w:val="19"/>
+        </w:rPr>
+      </w:pPr>
+      <w:r>
+        <w:rPr>
           <w:rFonts w:hint="default" w:ascii="Arial"/>
           <w:i/>
           <w:sz w:val="18"/>
         </w:rPr>
-      </w:pPr>
-      <w:r>
-        <w:rPr>
-          <w:rFonts w:hint="default" w:ascii="Arial"/>
-          <w:i/>
-          <w:sz w:val="18"/>
-        </w:rPr>
         <w:t>({{total_letras}})</w:t>
       </w:r>
-    </w:p>
-    <w:p>
-      <w:pPr>
-        <w:spacing w:before="94"/>
-        <w:ind w:left="120" w:right="0" w:firstLine="0"/>
-        <w:jc w:val="left"/>
-        <w:rPr>
-          <w:rFonts w:ascii="Arial"/>
-          <w:i/>
-          <w:sz w:val="18"/>
-        </w:rPr>
-      </w:pPr>
-    </w:p>
-    <w:p>
-      <w:pPr>
-        <w:pStyle w:val="5"/>
-        <w:spacing w:before="9"/>
-        <w:rPr>
-          <w:sz w:val="19"/>
-        </w:rPr>
-      </w:pPr>
     </w:p>
     <w:p>
       <w:pPr>
@@ -1479,9 +1401,6 @@
         <w:pStyle w:val="5"/>
         <w:spacing w:before="2"/>
         <w:ind w:left="120"/>
-        <w:rPr>
-          <w:rFonts w:hint="default"/>
-        </w:rPr>
       </w:pPr>
       <w:r>
         <w:rPr>
@@ -1489,202 +1408,12 @@
         </w:rPr>
         <w:t>{{observaciones}}</w:t>
       </w:r>
-    </w:p>
-    <w:p>
-      <w:pPr>
-        <w:pStyle w:val="5"/>
-        <w:spacing w:before="2"/>
-        <w:ind w:left="120"/>
-      </w:pPr>
-    </w:p>
-    <w:p>
-      <w:pPr>
-        <w:pStyle w:val="5"/>
-        <w:rPr>
-          <w:sz w:val="20"/>
-        </w:rPr>
-      </w:pPr>
-    </w:p>
-    <w:p>
-      <w:pPr>
-        <w:pStyle w:val="5"/>
-        <w:rPr>
-          <w:sz w:val="20"/>
-        </w:rPr>
-      </w:pPr>
-    </w:p>
-    <w:p>
-      <w:pPr>
-        <w:pStyle w:val="5"/>
-        <w:rPr>
-          <w:sz w:val="20"/>
-        </w:rPr>
-      </w:pPr>
-    </w:p>
-    <w:p>
-      <w:pPr>
-        <w:pStyle w:val="5"/>
-        <w:rPr>
-          <w:sz w:val="20"/>
-        </w:rPr>
-      </w:pPr>
-    </w:p>
-    <w:p>
-      <w:pPr>
-        <w:pStyle w:val="5"/>
-        <w:rPr>
-          <w:sz w:val="20"/>
-        </w:rPr>
-      </w:pPr>
-    </w:p>
-    <w:p>
-      <w:pPr>
-        <w:pStyle w:val="5"/>
-        <w:rPr>
-          <w:sz w:val="20"/>
-        </w:rPr>
-      </w:pPr>
-    </w:p>
-    <w:p>
-      <w:pPr>
-        <w:pStyle w:val="5"/>
-        <w:rPr>
-          <w:sz w:val="20"/>
-        </w:rPr>
-      </w:pPr>
-    </w:p>
-    <w:p>
-      <w:pPr>
-        <w:pStyle w:val="5"/>
-        <w:rPr>
-          <w:sz w:val="20"/>
-        </w:rPr>
-      </w:pPr>
-    </w:p>
-    <w:p>
-      <w:pPr>
-        <w:pStyle w:val="5"/>
-        <w:rPr>
-          <w:sz w:val="20"/>
-        </w:rPr>
-      </w:pPr>
-    </w:p>
-    <w:p>
-      <w:pPr>
-        <w:pStyle w:val="5"/>
-        <w:rPr>
-          <w:sz w:val="20"/>
-        </w:rPr>
-      </w:pPr>
-    </w:p>
-    <w:p>
-      <w:pPr>
-        <w:pStyle w:val="5"/>
-        <w:rPr>
-          <w:sz w:val="20"/>
-        </w:rPr>
-      </w:pPr>
-    </w:p>
-    <w:p>
-      <w:pPr>
-        <w:pStyle w:val="5"/>
-        <w:rPr>
-          <w:sz w:val="20"/>
-        </w:rPr>
-      </w:pPr>
       <w:bookmarkStart w:id="0" w:name="_GoBack"/>
       <w:bookmarkEnd w:id="0"/>
     </w:p>
-    <w:p>
-      <w:pPr>
-        <w:pStyle w:val="5"/>
-        <w:rPr>
-          <w:sz w:val="20"/>
-        </w:rPr>
-      </w:pPr>
-    </w:p>
-    <w:p>
-      <w:pPr>
-        <w:pStyle w:val="5"/>
-        <w:rPr>
-          <w:sz w:val="20"/>
-        </w:rPr>
-      </w:pPr>
-    </w:p>
-    <w:p>
-      <w:pPr>
-        <w:pStyle w:val="5"/>
-        <w:rPr>
-          <w:sz w:val="20"/>
-        </w:rPr>
-      </w:pPr>
-    </w:p>
-    <w:p>
-      <w:pPr>
-        <w:pStyle w:val="5"/>
-        <w:rPr>
-          <w:sz w:val="20"/>
-        </w:rPr>
-      </w:pPr>
-    </w:p>
-    <w:p>
-      <w:pPr>
-        <w:pStyle w:val="5"/>
-        <w:spacing w:before="8"/>
-        <w:rPr>
-          <w:sz w:val="17"/>
-        </w:rPr>
-      </w:pPr>
-    </w:p>
-    <w:p>
-      <w:pPr>
-        <w:pStyle w:val="5"/>
-        <w:spacing w:before="8"/>
-        <w:rPr>
-          <w:sz w:val="17"/>
-        </w:rPr>
-      </w:pPr>
-    </w:p>
-    <w:p>
-      <w:pPr>
-        <w:pStyle w:val="5"/>
-        <w:spacing w:before="8"/>
-        <w:rPr>
-          <w:sz w:val="17"/>
-        </w:rPr>
-      </w:pPr>
-    </w:p>
-    <w:p>
-      <w:pPr>
-        <w:pStyle w:val="5"/>
-        <w:spacing w:before="8"/>
-        <w:rPr>
-          <w:sz w:val="17"/>
-        </w:rPr>
-      </w:pPr>
-    </w:p>
-    <w:p>
-      <w:pPr>
-        <w:pStyle w:val="5"/>
-        <w:spacing w:before="8"/>
-        <w:rPr>
-          <w:sz w:val="17"/>
-        </w:rPr>
-      </w:pPr>
-    </w:p>
-    <w:p>
-      <w:pPr>
-        <w:pStyle w:val="5"/>
-        <w:spacing w:before="8"/>
-        <w:rPr>
-          <w:sz w:val="17"/>
-        </w:rPr>
-      </w:pPr>
-    </w:p>
-    <w:p/>
     <w:sectPr>
-      <w:headerReference r:id="rId6" w:type="default"/>
-      <w:footerReference r:id="rId7" w:type="default"/>
+      <w:headerReference r:id="rId7" w:type="default"/>
+      <w:footerReference r:id="rId8" w:type="default"/>
       <w:type w:val="continuous"/>
       <w:pgSz w:w="12240" w:h="15840"/>
       <w:pgMar w:top="320" w:right="300" w:bottom="280" w:left="280" w:header="720" w:footer="720" w:gutter="0"/>
@@ -1826,27 +1555,17 @@
       <w:ind w:left="3792" w:right="0" w:firstLine="0"/>
       <w:jc w:val="left"/>
       <w:rPr>
+        <w:rFonts w:hint="default"/>
         <w:sz w:val="12"/>
       </w:rPr>
     </w:pPr>
     <w:r>
       <w:rPr>
-        <w:sz w:val="12"/>
-      </w:rPr>
-      <w:t>H. AYUNTAMIENTO DE SOLEDAD DE GRACIANO SÁNCHEZ</w:t>
-    </w:r>
-    <w:r>
-      <w:rPr>
+        <w:rFonts w:hint="default"/>
         <w:spacing w:val="1"/>
         <w:sz w:val="12"/>
       </w:rPr>
-      <w:t xml:space="preserve"> </w:t>
-    </w:r>
-    <w:r>
-      <w:rPr>
-        <w:sz w:val="12"/>
-      </w:rPr>
-      <w:t>2021-2024</w:t>
+      <w:t>H.AYUNTAMIENTO DE VILLA DE POZOS 2024-2027</w:t>
     </w:r>
   </w:p>
   <w:p>
@@ -2042,6 +1761,128 @@
     <w:pPr>
       <w:pStyle w:val="7"/>
     </w:pPr>
+    <w:r>
+      <w:rPr>
+        <w:sz w:val="18"/>
+      </w:rPr>
+      <w:drawing>
+        <wp:anchor distT="0" distB="0" distL="114300" distR="114300" simplePos="0" relativeHeight="251660288" behindDoc="1" locked="0" layoutInCell="1" allowOverlap="1">
+          <wp:simplePos x="0" y="0"/>
+          <wp:positionH relativeFrom="margin">
+            <wp:align>center</wp:align>
+          </wp:positionH>
+          <wp:positionV relativeFrom="margin">
+            <wp:align>center</wp:align>
+          </wp:positionV>
+          <wp:extent cx="2400300" cy="2987040"/>
+          <wp:effectExtent l="0" t="0" r="0" b="0"/>
+          <wp:wrapNone/>
+          <wp:docPr id="13" name="WordPictureWatermark552636" descr="logo1-removebg-preview"/>
+          <wp:cNvGraphicFramePr>
+            <a:graphicFrameLocks xmlns:a="http://schemas.openxmlformats.org/drawingml/2006/main" noChangeAspect="1"/>
+          </wp:cNvGraphicFramePr>
+          <a:graphic xmlns:a="http://schemas.openxmlformats.org/drawingml/2006/main">
+            <a:graphicData uri="http://schemas.openxmlformats.org/drawingml/2006/picture">
+              <pic:pic xmlns:pic="http://schemas.openxmlformats.org/drawingml/2006/picture">
+                <pic:nvPicPr>
+                  <pic:cNvPr id="13" name="WordPictureWatermark552636" descr="logo1-removebg-preview"/>
+                  <pic:cNvPicPr>
+                    <a:picLocks noChangeAspect="1"/>
+                  </pic:cNvPicPr>
+                </pic:nvPicPr>
+                <pic:blipFill>
+                  <a:blip r:embed="rId1">
+                    <a:lum bright="69998" contrast="-70001"/>
+                  </a:blip>
+                  <a:stretch>
+                    <a:fillRect/>
+                  </a:stretch>
+                </pic:blipFill>
+                <pic:spPr>
+                  <a:xfrm>
+                    <a:off x="0" y="0"/>
+                    <a:ext cx="2400300" cy="2987040"/>
+                  </a:xfrm>
+                  <a:prstGeom prst="rect">
+                    <a:avLst/>
+                  </a:prstGeom>
+                  <a:noFill/>
+                  <a:ln>
+                    <a:noFill/>
+                  </a:ln>
+                </pic:spPr>
+              </pic:pic>
+            </a:graphicData>
+          </a:graphic>
+        </wp:anchor>
+      </w:drawing>
+    </w:r>
+  </w:p>
+</w:hdr>
+</file>
+
+<file path=word/header2.xml><?xml version="1.0" encoding="utf-8"?>
+<w:hdr xmlns:wpc="http://schemas.microsoft.com/office/word/2010/wordprocessingCanvas" xmlns:mc="http://schemas.openxmlformats.org/markup-compatibility/2006" xmlns:o="urn:schemas-microsoft-com:office:office" xmlns:r="http://schemas.openxmlformats.org/officeDocument/2006/relationships" xmlns:m="http://schemas.openxmlformats.org/officeDocument/2006/math" xmlns:v="urn:schemas-microsoft-com:vml" xmlns:wp14="http://schemas.microsoft.com/office/word/2010/wordprocessingDrawing" xmlns:wp="http://schemas.openxmlformats.org/drawingml/2006/wordprocessingDrawing" xmlns:w10="urn:schemas-microsoft-com:office:word" xmlns:w="http://schemas.openxmlformats.org/wordprocessingml/2006/main" xmlns:w14="http://schemas.microsoft.com/office/word/2010/wordml" xmlns:w15="http://schemas.microsoft.com/office/word/2012/wordml" xmlns:wpg="http://schemas.microsoft.com/office/word/2010/wordprocessingGroup" xmlns:wpi="http://schemas.microsoft.com/office/word/2010/wordprocessingInk" xmlns:wne="http://schemas.microsoft.com/office/word/2006/wordml" xmlns:wps="http://schemas.microsoft.com/office/word/2010/wordprocessingShape" xmlns:wpsCustomData="http://www.wps.cn/officeDocument/2013/wpsCustomData" mc:Ignorable="w14 w15 wp14">
+  <w:p>
+    <w:pPr>
+      <w:pStyle w:val="7"/>
+    </w:pPr>
+    <w:r>
+      <w:rPr>
+        <w:sz w:val="18"/>
+      </w:rPr>
+      <w:drawing>
+        <wp:anchor distT="0" distB="0" distL="114300" distR="114300" simplePos="0" relativeHeight="251661312" behindDoc="1" locked="0" layoutInCell="1" allowOverlap="1">
+          <wp:simplePos x="0" y="0"/>
+          <wp:positionH relativeFrom="margin">
+            <wp:align>center</wp:align>
+          </wp:positionH>
+          <wp:positionV relativeFrom="margin">
+            <wp:align>center</wp:align>
+          </wp:positionV>
+          <wp:extent cx="2400300" cy="2987040"/>
+          <wp:effectExtent l="0" t="0" r="0" b="0"/>
+          <wp:wrapNone/>
+          <wp:docPr id="14" name="WordPictureWatermark552636" descr="logo1-removebg-preview"/>
+          <wp:cNvGraphicFramePr>
+            <a:graphicFrameLocks xmlns:a="http://schemas.openxmlformats.org/drawingml/2006/main" noChangeAspect="1"/>
+          </wp:cNvGraphicFramePr>
+          <a:graphic xmlns:a="http://schemas.openxmlformats.org/drawingml/2006/main">
+            <a:graphicData uri="http://schemas.openxmlformats.org/drawingml/2006/picture">
+              <pic:pic xmlns:pic="http://schemas.openxmlformats.org/drawingml/2006/picture">
+                <pic:nvPicPr>
+                  <pic:cNvPr id="14" name="WordPictureWatermark552636" descr="logo1-removebg-preview"/>
+                  <pic:cNvPicPr>
+                    <a:picLocks noChangeAspect="1"/>
+                  </pic:cNvPicPr>
+                </pic:nvPicPr>
+                <pic:blipFill>
+                  <a:blip r:embed="rId1">
+                    <a:lum bright="69998" contrast="-70001"/>
+                  </a:blip>
+                  <a:stretch>
+                    <a:fillRect/>
+                  </a:stretch>
+                </pic:blipFill>
+                <pic:spPr>
+                  <a:xfrm>
+                    <a:off x="0" y="0"/>
+                    <a:ext cx="2400300" cy="2987040"/>
+                  </a:xfrm>
+                  <a:prstGeom prst="rect">
+                    <a:avLst/>
+                  </a:prstGeom>
+                  <a:noFill/>
+                  <a:ln>
+                    <a:noFill/>
+                  </a:ln>
+                </pic:spPr>
+              </pic:pic>
+            </a:graphicData>
+          </a:graphic>
+        </wp:anchor>
+      </w:drawing>
+    </w:r>
   </w:p>
 </w:hdr>
 </file>
@@ -2088,7 +1929,7 @@
     <w:lsdException w:unhideWhenUsed="0" w:uiPriority="0" w:semiHidden="0" w:name="Normal Indent"/>
     <w:lsdException w:unhideWhenUsed="0" w:uiPriority="0" w:semiHidden="0" w:name="footnote text"/>
     <w:lsdException w:unhideWhenUsed="0" w:uiPriority="0" w:semiHidden="0" w:name="annotation text"/>
-    <w:lsdException w:unhideWhenUsed="0" w:uiPriority="0" w:semiHidden="0" w:name="header"/>
+    <w:lsdException w:qFormat="1" w:unhideWhenUsed="0" w:uiPriority="0" w:semiHidden="0" w:name="header"/>
     <w:lsdException w:qFormat="1" w:unhideWhenUsed="0" w:uiPriority="0" w:semiHidden="0" w:name="footer"/>
     <w:lsdException w:unhideWhenUsed="0" w:uiPriority="0" w:semiHidden="0" w:name="index heading"/>
     <w:lsdException w:qFormat="1" w:uiPriority="0" w:name="caption"/>
@@ -2399,6 +2240,7 @@
   <w:style w:type="paragraph" w:styleId="7">
     <w:name w:val="header"/>
     <w:basedOn w:val="1"/>
+    <w:qFormat/>
     <w:uiPriority w:val="0"/>
     <w:pPr>
       <w:tabs>

</xml_diff>